<commit_message>
Added advanced filtering + EventType field
- Added advanced filtering for the search function that allows filtering by a range of factors such as data range and event type
- Updated database and corresponding views for Event Types
</commit_message>
<xml_diff>
--- a/CLDVPOE2_WesleyLinkmeyer_st10481890.docx
+++ b/CLDVPOE2_WesleyLinkmeyer_st10481890.docx
@@ -1273,6 +1273,9 @@
     </w:p>
     <w:p>
       <w:r>
+        <w:rPr>
+          <w:noProof/>
+        </w:rPr>
         <w:drawing>
           <wp:inline distT="0" distB="0" distL="0" distR="0" wp14:anchorId="401A82EC" wp14:editId="34364824">
             <wp:extent cx="5731510" cy="3223895"/>
@@ -1312,6 +1315,9 @@
     </w:p>
     <w:p>
       <w:r>
+        <w:rPr>
+          <w:noProof/>
+        </w:rPr>
         <w:drawing>
           <wp:inline distT="0" distB="0" distL="0" distR="0" wp14:anchorId="34ED90C8" wp14:editId="065B83F0">
             <wp:extent cx="5731510" cy="3223895"/>
@@ -1351,6 +1357,9 @@
     </w:p>
     <w:p>
       <w:r>
+        <w:rPr>
+          <w:noProof/>
+        </w:rPr>
         <w:lastRenderedPageBreak/>
         <w:drawing>
           <wp:inline distT="0" distB="0" distL="0" distR="0" wp14:anchorId="624C1CEC" wp14:editId="572B351B">
@@ -1391,6 +1400,9 @@
     </w:p>
     <w:p>
       <w:r>
+        <w:rPr>
+          <w:noProof/>
+        </w:rPr>
         <w:lastRenderedPageBreak/>
         <w:drawing>
           <wp:inline distT="0" distB="0" distL="0" distR="0" wp14:anchorId="1A080978" wp14:editId="75C6C0AB">
@@ -1435,6 +1447,9 @@
         <w:t xml:space="preserve"> </w:t>
       </w:r>
       <w:r>
+        <w:rPr>
+          <w:noProof/>
+        </w:rPr>
         <w:drawing>
           <wp:inline distT="0" distB="0" distL="0" distR="0" wp14:anchorId="6DFCC8AC" wp14:editId="7360C347">
             <wp:extent cx="5731510" cy="3223895"/>
@@ -1796,6 +1811,9 @@
       <w:bookmarkStart w:id="7" w:name="_Toc229054524"/>
       <w:r>
         <w:t>Theory</w:t>
+      </w:r>
+      <w:r>
+        <w:t xml:space="preserve"> (Rubric Section D)</w:t>
       </w:r>
       <w:r>
         <w:t>:</w:t>

</xml_diff>